<commit_message>
Disable in-app auto update so Chinese builds cannot be replaced by upstream
- Remove the updater call from SqualrEngine::initialize and delete
  squalr-engine/src/app_provisioner/updater/, including the dead
  UpdateStatus/UpdateProgress/PerformUpdateTask remnants.
- Drop the now unused self-replace and semver dependencies.
- Document the removal in both READMEs, the release artifact contract, the
  packaged 使用说明, and tutorial FAQ Q11.
- Refresh the GUI screenshot and tutorial docx from the repackaged build.
</commit_message>
<xml_diff>
--- a/docs/zh-CN/Squalr中文版使用教程.docx
+++ b/docs/zh-CN/Squalr中文版使用教程.docx
@@ -10344,6 +10344,104 @@
           <w:sz w:val="20"/>
         </w:rPr>
         <w:t>若仍然闪退，请记录下操作步骤与输出窗口最后几条日志。</w:t>
+      </w:r>
+    </w:p>
+    <w:p>
+      <w:pPr>
+        <w:pStyle w:val="Heading2"/>
+      </w:pPr>
+      <w:r>
+        <w:rPr>
+          <w:rFonts w:ascii="微软雅黑" w:hAnsi="微软雅黑" w:eastAsia="微软雅黑"/>
+          <w:b/>
+        </w:rPr>
+        <w:t>Q11：程序会自己更新吗？怎么升到新版本</w:t>
+      </w:r>
+    </w:p>
+    <w:p>
+      <w:r>
+        <w:rPr>
+          <w:rFonts w:ascii="微软雅黑" w:hAnsi="微软雅黑" w:eastAsia="微软雅黑"/>
+          <w:b w:val="0"/>
+          <w:sz w:val="20"/>
+        </w:rPr>
+        <w:t>不会自动更新。本汉化版已</w:t>
+      </w:r>
+      <w:r>
+        <w:rPr>
+          <w:rFonts w:ascii="微软雅黑" w:hAnsi="微软雅黑" w:eastAsia="微软雅黑"/>
+          <w:b/>
+          <w:sz w:val="20"/>
+        </w:rPr>
+        <w:t>禁用应用内自动更新</w:t>
+      </w:r>
+      <w:r>
+        <w:rPr>
+          <w:rFonts w:ascii="微软雅黑" w:hAnsi="微软雅黑" w:eastAsia="微软雅黑"/>
+          <w:b w:val="0"/>
+          <w:sz w:val="20"/>
+        </w:rPr>
+        <w:t>：程序启动时不会联网检查版本，也不会下载并替换自身。原因是上游发布的更新包是英文版，保留自动更新会在上游发版时把中文界面覆盖掉。</w:t>
+      </w:r>
+    </w:p>
+    <w:p>
+      <w:r>
+        <w:rPr>
+          <w:rFonts w:ascii="微软雅黑" w:hAnsi="微软雅黑" w:eastAsia="微软雅黑"/>
+          <w:b w:val="0"/>
+          <w:sz w:val="20"/>
+        </w:rPr>
+        <w:t xml:space="preserve">需要新版本时，请前往本仓库的 </w:t>
+      </w:r>
+      <w:r>
+        <w:rPr>
+          <w:rFonts w:ascii="微软雅黑" w:hAnsi="微软雅黑" w:eastAsia="微软雅黑"/>
+          <w:b/>
+          <w:sz w:val="20"/>
+        </w:rPr>
+        <w:t>Releases</w:t>
+      </w:r>
+      <w:r>
+        <w:rPr>
+          <w:rFonts w:ascii="微软雅黑" w:hAnsi="微软雅黑" w:eastAsia="微软雅黑"/>
+          <w:b w:val="0"/>
+          <w:sz w:val="20"/>
+        </w:rPr>
+        <w:t xml:space="preserve"> 页面手动下载，解压后覆盖旧目录即可。配置文件（</w:t>
+      </w:r>
+      <w:r>
+        <w:rPr>
+          <w:rFonts w:ascii="Consolas" w:hAnsi="Consolas" w:eastAsia="Consolas"/>
+          <w:b w:val="0"/>
+          <w:color w:val="B03060"/>
+          <w:sz w:val="20"/>
+        </w:rPr>
+        <w:t>docking_settings.json</w:t>
+      </w:r>
+      <w:r>
+        <w:rPr>
+          <w:rFonts w:ascii="微软雅黑" w:hAnsi="微软雅黑" w:eastAsia="微软雅黑"/>
+          <w:b w:val="0"/>
+          <w:sz w:val="20"/>
+        </w:rPr>
+        <w:t xml:space="preserve"> 等）位于程序目录内，项目文件默认在 </w:t>
+      </w:r>
+      <w:r>
+        <w:rPr>
+          <w:rFonts w:ascii="Consolas" w:hAnsi="Consolas" w:eastAsia="Consolas"/>
+          <w:b w:val="0"/>
+          <w:color w:val="B03060"/>
+          <w:sz w:val="20"/>
+        </w:rPr>
+        <w:t>文档\Squalr\</w:t>
+      </w:r>
+      <w:r>
+        <w:rPr>
+          <w:rFonts w:ascii="微软雅黑" w:hAnsi="微软雅黑" w:eastAsia="微软雅黑"/>
+          <w:b w:val="0"/>
+          <w:sz w:val="20"/>
+        </w:rPr>
+        <w:t>，覆盖程序不会丢失它们。</w:t>
       </w:r>
     </w:p>
     <w:p>

</xml_diff>